<commit_message>
Landing publica, login con roles, bitacora de auditoria, panel de calidad y exportacion CSV; 216 pruebas automatizadas
</commit_message>
<xml_diff>
--- a/Docs/InformeAuditoria.docx
+++ b/Docs/InformeAuditoria.docx
@@ -678,7 +678,7 @@
           <w:sz w:val="22"/>
           <w:szCs w:val="22"/>
         </w:rPr>
-        <w:t xml:space="preserve">5 no conformidades corregidas durante el sprint</w:t>
+        <w:t xml:space="preserve">6 no conformidades corregidas durante el sprint</w:t>
       </w:r>
       <w:r>
         <w:rPr>
@@ -686,7 +686,7 @@
           <w:sz w:val="22"/>
           <w:szCs w:val="22"/>
         </w:rPr>
-        <w:t xml:space="preserve"> (3 de severidad mayor, 2 menores) y </w:t>
+        <w:t xml:space="preserve"> (1 crítica, 3 mayores y 2 menores) y </w:t>
       </w:r>
       <w:r>
         <w:rPr>
@@ -695,7 +695,7 @@
           <w:sz w:val="22"/>
           <w:szCs w:val="22"/>
         </w:rPr>
-        <w:t xml:space="preserve">5 observaciones que quedan como deuda técnica</w:t>
+        <w:t xml:space="preserve">4 observaciones que quedan como deuda técnica</w:t>
       </w:r>
       <w:r>
         <w:rPr>
@@ -712,7 +712,7 @@
           <w:sz w:val="22"/>
           <w:szCs w:val="22"/>
         </w:rPr>
-        <w:t xml:space="preserve">164 de 164 pruebas</w:t>
+        <w:t xml:space="preserve">216 de 216 pruebas</w:t>
       </w:r>
       <w:r>
         <w:rPr>
@@ -729,7 +729,7 @@
           <w:sz w:val="22"/>
           <w:szCs w:val="22"/>
         </w:rPr>
-        <w:t xml:space="preserve">78.8 %</w:t>
+        <w:t xml:space="preserve">81.3 %</w:t>
       </w:r>
       <w:r>
         <w:rPr>
@@ -760,7 +760,7 @@
           <w:sz w:val="22"/>
           <w:szCs w:val="22"/>
         </w:rPr>
-        <w:t xml:space="preserve"> el producto cumple los criterios de salida del sprint. La ausencia de autenticación (OBS-01) es el riesgo principal y debe atenderse en el siguiente sprint antes de cualquier uso productivo.</w:t>
+        <w:t xml:space="preserve"> el producto cumple los criterios de salida del sprint. El riesgo principal detectado (ausencia de autenticación) se corrigió con inicio de sesión, roles y bitácora de auditoría; queda pendiente cambiar las claves de demostración antes de cualquier uso productivo.</w:t>
       </w:r>
     </w:p>
     <w:p>
@@ -787,12 +787,12 @@
       </w:tblPr>
       <w:tblGrid>
         <w:gridCol w:w="900"/>
-        <w:gridCol w:w="2112"/>
+        <w:gridCol w:w="2008"/>
         <w:gridCol w:w="900"/>
-        <w:gridCol w:w="1830"/>
-        <w:gridCol w:w="2112"/>
-        <w:gridCol w:w="1901"/>
-        <w:gridCol w:w="-917"/>
+        <w:gridCol w:w="1975"/>
+        <w:gridCol w:w="2008"/>
+        <w:gridCol w:w="2008"/>
+        <w:gridCol w:w="-961"/>
       </w:tblGrid>
       <w:tr>
         <w:trPr>
@@ -820,7 +820,7 @@
         </w:tc>
         <w:tc>
           <w:tcPr>
-            <w:tcW w:w="2112" w:type="dxa"/>
+            <w:tcW w:w="2008" w:type="dxa"/>
           </w:tcPr>
           <w:p>
             <w:pPr>
@@ -860,7 +860,7 @@
         </w:tc>
         <w:tc>
           <w:tcPr>
-            <w:tcW w:w="1830" w:type="dxa"/>
+            <w:tcW w:w="1975" w:type="dxa"/>
           </w:tcPr>
           <w:p>
             <w:pPr>
@@ -880,7 +880,7 @@
         </w:tc>
         <w:tc>
           <w:tcPr>
-            <w:tcW w:w="2112" w:type="dxa"/>
+            <w:tcW w:w="2008" w:type="dxa"/>
           </w:tcPr>
           <w:p>
             <w:pPr>
@@ -900,7 +900,7 @@
         </w:tc>
         <w:tc>
           <w:tcPr>
-            <w:tcW w:w="1901" w:type="dxa"/>
+            <w:tcW w:w="2008" w:type="dxa"/>
           </w:tcPr>
           <w:p>
             <w:pPr>
@@ -920,7 +920,7 @@
         </w:tc>
         <w:tc>
           <w:tcPr>
-            <w:tcW w:w="-917" w:type="dxa"/>
+            <w:tcW w:w="-961" w:type="dxa"/>
           </w:tcPr>
           <w:p>
             <w:pPr>
@@ -964,7 +964,7 @@
         </w:tc>
         <w:tc>
           <w:tcPr>
-            <w:tcW w:w="2112" w:type="dxa"/>
+            <w:tcW w:w="2008" w:type="dxa"/>
           </w:tcPr>
           <w:p>
             <w:pPr>
@@ -1002,7 +1002,7 @@
         </w:tc>
         <w:tc>
           <w:tcPr>
-            <w:tcW w:w="1830" w:type="dxa"/>
+            <w:tcW w:w="1975" w:type="dxa"/>
           </w:tcPr>
           <w:p>
             <w:pPr>
@@ -1038,7 +1038,7 @@
         </w:tc>
         <w:tc>
           <w:tcPr>
-            <w:tcW w:w="2112" w:type="dxa"/>
+            <w:tcW w:w="2008" w:type="dxa"/>
           </w:tcPr>
           <w:p>
             <w:pPr>
@@ -1074,7 +1074,7 @@
         </w:tc>
         <w:tc>
           <w:tcPr>
-            <w:tcW w:w="1901" w:type="dxa"/>
+            <w:tcW w:w="2008" w:type="dxa"/>
           </w:tcPr>
           <w:p>
             <w:pPr>
@@ -1102,7 +1102,7 @@
         </w:tc>
         <w:tc>
           <w:tcPr>
-            <w:tcW w:w="-917" w:type="dxa"/>
+            <w:tcW w:w="-961" w:type="dxa"/>
           </w:tcPr>
           <w:p>
             <w:pPr>
@@ -1145,7 +1145,7 @@
         </w:tc>
         <w:tc>
           <w:tcPr>
-            <w:tcW w:w="2112" w:type="dxa"/>
+            <w:tcW w:w="2008" w:type="dxa"/>
           </w:tcPr>
           <w:p>
             <w:pPr>
@@ -1200,7 +1200,7 @@
         </w:tc>
         <w:tc>
           <w:tcPr>
-            <w:tcW w:w="1830" w:type="dxa"/>
+            <w:tcW w:w="1975" w:type="dxa"/>
           </w:tcPr>
           <w:p>
             <w:pPr>
@@ -1219,7 +1219,7 @@
         </w:tc>
         <w:tc>
           <w:tcPr>
-            <w:tcW w:w="2112" w:type="dxa"/>
+            <w:tcW w:w="2008" w:type="dxa"/>
           </w:tcPr>
           <w:p>
             <w:pPr>
@@ -1255,7 +1255,7 @@
         </w:tc>
         <w:tc>
           <w:tcPr>
-            <w:tcW w:w="1901" w:type="dxa"/>
+            <w:tcW w:w="2008" w:type="dxa"/>
           </w:tcPr>
           <w:p>
             <w:pPr>
@@ -1275,7 +1275,7 @@
         </w:tc>
         <w:tc>
           <w:tcPr>
-            <w:tcW w:w="-917" w:type="dxa"/>
+            <w:tcW w:w="-961" w:type="dxa"/>
           </w:tcPr>
           <w:p>
             <w:pPr>
@@ -1318,7 +1318,7 @@
         </w:tc>
         <w:tc>
           <w:tcPr>
-            <w:tcW w:w="2112" w:type="dxa"/>
+            <w:tcW w:w="2008" w:type="dxa"/>
           </w:tcPr>
           <w:p>
             <w:pPr>
@@ -1356,7 +1356,7 @@
         </w:tc>
         <w:tc>
           <w:tcPr>
-            <w:tcW w:w="1830" w:type="dxa"/>
+            <w:tcW w:w="1975" w:type="dxa"/>
           </w:tcPr>
           <w:p>
             <w:pPr>
@@ -1375,7 +1375,7 @@
         </w:tc>
         <w:tc>
           <w:tcPr>
-            <w:tcW w:w="2112" w:type="dxa"/>
+            <w:tcW w:w="2008" w:type="dxa"/>
           </w:tcPr>
           <w:p>
             <w:pPr>
@@ -1403,7 +1403,7 @@
         </w:tc>
         <w:tc>
           <w:tcPr>
-            <w:tcW w:w="1901" w:type="dxa"/>
+            <w:tcW w:w="2008" w:type="dxa"/>
           </w:tcPr>
           <w:p>
             <w:pPr>
@@ -1423,7 +1423,7 @@
         </w:tc>
         <w:tc>
           <w:tcPr>
-            <w:tcW w:w="-917" w:type="dxa"/>
+            <w:tcW w:w="-961" w:type="dxa"/>
           </w:tcPr>
           <w:p>
             <w:pPr>
@@ -1466,7 +1466,7 @@
         </w:tc>
         <w:tc>
           <w:tcPr>
-            <w:tcW w:w="2112" w:type="dxa"/>
+            <w:tcW w:w="2008" w:type="dxa"/>
           </w:tcPr>
           <w:p>
             <w:pPr>
@@ -1504,7 +1504,7 @@
         </w:tc>
         <w:tc>
           <w:tcPr>
-            <w:tcW w:w="1830" w:type="dxa"/>
+            <w:tcW w:w="1975" w:type="dxa"/>
           </w:tcPr>
           <w:p>
             <w:pPr>
@@ -1523,7 +1523,7 @@
         </w:tc>
         <w:tc>
           <w:tcPr>
-            <w:tcW w:w="2112" w:type="dxa"/>
+            <w:tcW w:w="2008" w:type="dxa"/>
           </w:tcPr>
           <w:p>
             <w:pPr>
@@ -1568,7 +1568,7 @@
         </w:tc>
         <w:tc>
           <w:tcPr>
-            <w:tcW w:w="1901" w:type="dxa"/>
+            <w:tcW w:w="2008" w:type="dxa"/>
           </w:tcPr>
           <w:p>
             <w:pPr>
@@ -1596,7 +1596,7 @@
         </w:tc>
         <w:tc>
           <w:tcPr>
-            <w:tcW w:w="-917" w:type="dxa"/>
+            <w:tcW w:w="-961" w:type="dxa"/>
           </w:tcPr>
           <w:p>
             <w:pPr>
@@ -1633,26 +1633,26 @@
                 <w:sz w:val="18"/>
                 <w:szCs w:val="18"/>
               </w:rPr>
-              <w:t xml:space="preserve">DEF-05</w:t>
-            </w:r>
-          </w:p>
-        </w:tc>
-        <w:tc>
-          <w:tcPr>
-            <w:tcW w:w="2112" w:type="dxa"/>
-          </w:tcPr>
-          <w:p>
-            <w:pPr>
-              <w:spacing w:before="40" w:after="40" w:line="240" w:lineRule="auto"/>
-              <w:jc w:val="left"/>
-            </w:pPr>
-            <w:r>
-              <w:rPr>
-                <w:color w:val="000000"/>
-                <w:sz w:val="18"/>
-                <w:szCs w:val="18"/>
-              </w:rPr>
-              <w:t xml:space="preserve">Respuestas sin cabeceras de seguridad básicas</w:t>
+              <w:t xml:space="preserve">DEF-06</w:t>
+            </w:r>
+          </w:p>
+        </w:tc>
+        <w:tc>
+          <w:tcPr>
+            <w:tcW w:w="2008" w:type="dxa"/>
+          </w:tcPr>
+          <w:p>
+            <w:pPr>
+              <w:spacing w:before="40" w:after="40" w:line="240" w:lineRule="auto"/>
+              <w:jc w:val="left"/>
+            </w:pPr>
+            <w:r>
+              <w:rPr>
+                <w:color w:val="000000"/>
+                <w:sz w:val="18"/>
+                <w:szCs w:val="18"/>
+              </w:rPr>
+              <w:t xml:space="preserve">No existía autenticación ni control de acceso: cualquier visitante podía crear, editar o eliminar datos</w:t>
             </w:r>
           </w:p>
         </w:tc>
@@ -1671,46 +1671,57 @@
                 <w:sz w:val="18"/>
                 <w:szCs w:val="18"/>
               </w:rPr>
-              <w:t xml:space="preserve">Menor</w:t>
-            </w:r>
-          </w:p>
-        </w:tc>
-        <w:tc>
-          <w:tcPr>
-            <w:tcW w:w="1830" w:type="dxa"/>
-          </w:tcPr>
-          <w:p>
-            <w:pPr>
-              <w:spacing w:before="40" w:after="40" w:line="240" w:lineRule="auto"/>
-              <w:jc w:val="left"/>
-            </w:pPr>
-            <w:r>
-              <w:rPr>
-                <w:color w:val="000000"/>
-                <w:sz w:val="18"/>
-                <w:szCs w:val="18"/>
-              </w:rPr>
-              <w:t xml:space="preserve">Revisión de configuración (OWASP)</w:t>
-            </w:r>
-          </w:p>
-        </w:tc>
-        <w:tc>
-          <w:tcPr>
-            <w:tcW w:w="2112" w:type="dxa"/>
-          </w:tcPr>
-          <w:p>
-            <w:pPr>
-              <w:spacing w:before="40" w:after="40" w:line="240" w:lineRule="auto"/>
-              <w:jc w:val="left"/>
-            </w:pPr>
-            <w:r>
-              <w:rPr>
-                <w:color w:val="000000"/>
-                <w:sz w:val="18"/>
-                <w:szCs w:val="18"/>
-              </w:rPr>
-              <w:t xml:space="preserve">Middleware con </w:t>
-            </w:r>
+              <w:t xml:space="preserve">Crítica</w:t>
+            </w:r>
+          </w:p>
+        </w:tc>
+        <w:tc>
+          <w:tcPr>
+            <w:tcW w:w="1975" w:type="dxa"/>
+          </w:tcPr>
+          <w:p>
+            <w:pPr>
+              <w:spacing w:before="40" w:after="40" w:line="240" w:lineRule="auto"/>
+              <w:jc w:val="left"/>
+            </w:pPr>
+            <w:r>
+              <w:rPr>
+                <w:color w:val="000000"/>
+                <w:sz w:val="18"/>
+                <w:szCs w:val="18"/>
+              </w:rPr>
+              <w:t xml:space="preserve">Revisión de arquitectura y de la configuración de seguridad</w:t>
+            </w:r>
+          </w:p>
+        </w:tc>
+        <w:tc>
+          <w:tcPr>
+            <w:tcW w:w="2008" w:type="dxa"/>
+          </w:tcPr>
+          <w:p>
+            <w:pPr>
+              <w:spacing w:before="40" w:after="40" w:line="240" w:lineRule="auto"/>
+              <w:jc w:val="left"/>
+            </w:pPr>
+            <w:r>
+              <w:rPr>
+                <w:color w:val="000000"/>
+                <w:sz w:val="18"/>
+                <w:szCs w:val="18"/>
+              </w:rPr>
+              <w:t xml:space="preserve">Login con cookie HttpOnly, claves con hash PBKDF2, política de acceso por defecto (todo requiere sesión), roles Administrador/Cajero/Mesero y bitácora de auditoría</w:t>
+            </w:r>
+          </w:p>
+        </w:tc>
+        <w:tc>
+          <w:tcPr>
+            <w:tcW w:w="2008" w:type="dxa"/>
+          </w:tcPr>
+          <w:p>
+            <w:pPr>
+              <w:spacing w:before="40" w:after="40" w:line="240" w:lineRule="auto"/>
+              <w:jc w:val="left"/>
+            </w:pPr>
             <w:r>
               <w:rPr>
                 <w:rFonts w:ascii="Consolas" w:hAnsi="Consolas" w:cs="Consolas"/>
@@ -1718,15 +1729,15 @@
                 <w:sz w:val="16"/>
                 <w:szCs w:val="16"/>
               </w:rPr>
-              <w:t xml:space="preserve">X-Content-Type-Options</w:t>
-            </w:r>
-            <w:r>
-              <w:rPr>
-                <w:color w:val="000000"/>
-                <w:sz w:val="18"/>
-                <w:szCs w:val="18"/>
-              </w:rPr>
-              <w:t xml:space="preserve">, </w:t>
+              <w:t xml:space="preserve">SeguridadTests</w:t>
+            </w:r>
+            <w:r>
+              <w:rPr>
+                <w:color w:val="000000"/>
+                <w:sz w:val="18"/>
+                <w:szCs w:val="18"/>
+              </w:rPr>
+              <w:t xml:space="preserve"> (24), </w:t>
             </w:r>
             <w:r>
               <w:rPr>
@@ -1735,15 +1746,134 @@
                 <w:sz w:val="16"/>
                 <w:szCs w:val="16"/>
               </w:rPr>
-              <w:t xml:space="preserve">X-Frame-Options</w:t>
-            </w:r>
-            <w:r>
-              <w:rPr>
-                <w:color w:val="000000"/>
-                <w:sz w:val="18"/>
-                <w:szCs w:val="18"/>
-              </w:rPr>
-              <w:t xml:space="preserve">, </w:t>
+              <w:t xml:space="preserve">BitacoraTests</w:t>
+            </w:r>
+            <w:r>
+              <w:rPr>
+                <w:color w:val="000000"/>
+                <w:sz w:val="18"/>
+                <w:szCs w:val="18"/>
+              </w:rPr>
+              <w:t xml:space="preserve"> (7), E2E-12 a E2E-17, Cypress "Acceso, landing y roles"</w:t>
+            </w:r>
+          </w:p>
+        </w:tc>
+        <w:tc>
+          <w:tcPr>
+            <w:tcW w:w="-961" w:type="dxa"/>
+          </w:tcPr>
+          <w:p>
+            <w:pPr>
+              <w:spacing w:before="40" w:after="40" w:line="240" w:lineRule="auto"/>
+              <w:jc w:val="left"/>
+            </w:pPr>
+            <w:r>
+              <w:rPr>
+                <w:color w:val="000000"/>
+                <w:sz w:val="18"/>
+                <w:szCs w:val="18"/>
+              </w:rPr>
+              <w:t xml:space="preserve">Cerrado</w:t>
+            </w:r>
+          </w:p>
+        </w:tc>
+      </w:tr>
+      <w:tr>
+        <w:trPr>
+          <w:cantSplit/>
+        </w:trPr>
+        <w:tc>
+          <w:tcPr>
+            <w:tcW w:w="900" w:type="dxa"/>
+          </w:tcPr>
+          <w:p>
+            <w:pPr>
+              <w:spacing w:before="40" w:after="40" w:line="240" w:lineRule="auto"/>
+              <w:jc w:val="left"/>
+            </w:pPr>
+            <w:r>
+              <w:rPr>
+                <w:color w:val="000000"/>
+                <w:sz w:val="18"/>
+                <w:szCs w:val="18"/>
+              </w:rPr>
+              <w:t xml:space="preserve">DEF-05</w:t>
+            </w:r>
+          </w:p>
+        </w:tc>
+        <w:tc>
+          <w:tcPr>
+            <w:tcW w:w="2008" w:type="dxa"/>
+          </w:tcPr>
+          <w:p>
+            <w:pPr>
+              <w:spacing w:before="40" w:after="40" w:line="240" w:lineRule="auto"/>
+              <w:jc w:val="left"/>
+            </w:pPr>
+            <w:r>
+              <w:rPr>
+                <w:color w:val="000000"/>
+                <w:sz w:val="18"/>
+                <w:szCs w:val="18"/>
+              </w:rPr>
+              <w:t xml:space="preserve">Respuestas sin cabeceras de seguridad básicas</w:t>
+            </w:r>
+          </w:p>
+        </w:tc>
+        <w:tc>
+          <w:tcPr>
+            <w:tcW w:w="900" w:type="dxa"/>
+          </w:tcPr>
+          <w:p>
+            <w:pPr>
+              <w:spacing w:before="40" w:after="40" w:line="240" w:lineRule="auto"/>
+              <w:jc w:val="left"/>
+            </w:pPr>
+            <w:r>
+              <w:rPr>
+                <w:color w:val="000000"/>
+                <w:sz w:val="18"/>
+                <w:szCs w:val="18"/>
+              </w:rPr>
+              <w:t xml:space="preserve">Menor</w:t>
+            </w:r>
+          </w:p>
+        </w:tc>
+        <w:tc>
+          <w:tcPr>
+            <w:tcW w:w="1975" w:type="dxa"/>
+          </w:tcPr>
+          <w:p>
+            <w:pPr>
+              <w:spacing w:before="40" w:after="40" w:line="240" w:lineRule="auto"/>
+              <w:jc w:val="left"/>
+            </w:pPr>
+            <w:r>
+              <w:rPr>
+                <w:color w:val="000000"/>
+                <w:sz w:val="18"/>
+                <w:szCs w:val="18"/>
+              </w:rPr>
+              <w:t xml:space="preserve">Revisión de configuración (OWASP)</w:t>
+            </w:r>
+          </w:p>
+        </w:tc>
+        <w:tc>
+          <w:tcPr>
+            <w:tcW w:w="2008" w:type="dxa"/>
+          </w:tcPr>
+          <w:p>
+            <w:pPr>
+              <w:spacing w:before="40" w:after="40" w:line="240" w:lineRule="auto"/>
+              <w:jc w:val="left"/>
+            </w:pPr>
+            <w:r>
+              <w:rPr>
+                <w:color w:val="000000"/>
+                <w:sz w:val="18"/>
+                <w:szCs w:val="18"/>
+              </w:rPr>
+              <w:t xml:space="preserve">Middleware con </w:t>
             </w:r>
             <w:r>
               <w:rPr>
@@ -1752,19 +1882,16 @@
                 <w:sz w:val="16"/>
                 <w:szCs w:val="16"/>
               </w:rPr>
-              <w:t xml:space="preserve">Referrer-Policy</w:t>
-            </w:r>
-          </w:p>
-        </w:tc>
-        <w:tc>
-          <w:tcPr>
-            <w:tcW w:w="1901" w:type="dxa"/>
-          </w:tcPr>
-          <w:p>
-            <w:pPr>
-              <w:spacing w:before="40" w:after="40" w:line="240" w:lineRule="auto"/>
-              <w:jc w:val="left"/>
-            </w:pPr>
+              <w:t xml:space="preserve">X-Content-Type-Options</w:t>
+            </w:r>
+            <w:r>
+              <w:rPr>
+                <w:color w:val="000000"/>
+                <w:sz w:val="18"/>
+                <w:szCs w:val="18"/>
+              </w:rPr>
+              <w:t xml:space="preserve">, </w:t>
+            </w:r>
             <w:r>
               <w:rPr>
                 <w:rFonts w:ascii="Consolas" w:hAnsi="Consolas" w:cs="Consolas"/>
@@ -1772,6 +1899,43 @@
                 <w:sz w:val="16"/>
                 <w:szCs w:val="16"/>
               </w:rPr>
+              <w:t xml:space="preserve">X-Frame-Options</w:t>
+            </w:r>
+            <w:r>
+              <w:rPr>
+                <w:color w:val="000000"/>
+                <w:sz w:val="18"/>
+                <w:szCs w:val="18"/>
+              </w:rPr>
+              <w:t xml:space="preserve">, </w:t>
+            </w:r>
+            <w:r>
+              <w:rPr>
+                <w:rFonts w:ascii="Consolas" w:hAnsi="Consolas" w:cs="Consolas"/>
+                <w:color w:val="000000"/>
+                <w:sz w:val="16"/>
+                <w:szCs w:val="16"/>
+              </w:rPr>
+              <w:t xml:space="preserve">Referrer-Policy</w:t>
+            </w:r>
+          </w:p>
+        </w:tc>
+        <w:tc>
+          <w:tcPr>
+            <w:tcW w:w="2008" w:type="dxa"/>
+          </w:tcPr>
+          <w:p>
+            <w:pPr>
+              <w:spacing w:before="40" w:after="40" w:line="240" w:lineRule="auto"/>
+              <w:jc w:val="left"/>
+            </w:pPr>
+            <w:r>
+              <w:rPr>
+                <w:rFonts w:ascii="Consolas" w:hAnsi="Consolas" w:cs="Consolas"/>
+                <w:color w:val="000000"/>
+                <w:sz w:val="16"/>
+                <w:szCs w:val="16"/>
+              </w:rPr>
               <w:t xml:space="preserve">RespuestasHtml_IncluyenCabecerasDeSeguridad</w:t>
             </w:r>
             <w:r>
@@ -1786,7 +1950,7 @@
         </w:tc>
         <w:tc>
           <w:tcPr>
-            <w:tcW w:w="-917" w:type="dxa"/>
+            <w:tcW w:w="-961" w:type="dxa"/>
           </w:tcPr>
           <w:p>
             <w:pPr>
@@ -1821,7 +1985,7 @@
           <w:sz w:val="22"/>
           <w:szCs w:val="22"/>
         </w:rPr>
-        <w:t xml:space="preserve">Las pruebas de los cinco hallazgos se escribieron </w:t>
+        <w:t xml:space="preserve">Las pruebas de DEF-01 a DEF-05 se escribieron </w:t>
       </w:r>
       <w:r>
         <w:rPr>
@@ -1838,7 +2002,7 @@
           <w:sz w:val="22"/>
           <w:szCs w:val="22"/>
         </w:rPr>
-        <w:t xml:space="preserve"> de la corrección: 91 de 96 pasaban y los 5 fallos correspondían exactamente a estos defectos (</w:t>
+        <w:t xml:space="preserve"> de la corrección (DEF-06 se cubrió con pruebas de aceptación al cerrar el incremento): 91 de 96 pasaban y los 5 fallos correspondían exactamente a estos defectos (</w:t>
       </w:r>
       <w:r>
         <w:rPr>
@@ -1882,10 +2046,10 @@
       </w:tblPr>
       <w:tblGrid>
         <w:gridCol w:w="900"/>
-        <w:gridCol w:w="3233"/>
+        <w:gridCol w:w="3421"/>
         <w:gridCol w:w="900"/>
-        <w:gridCol w:w="3233"/>
-        <w:gridCol w:w="572"/>
+        <w:gridCol w:w="3421"/>
+        <w:gridCol w:w="196"/>
       </w:tblGrid>
       <w:tr>
         <w:trPr>
@@ -1913,7 +2077,7 @@
         </w:tc>
         <w:tc>
           <w:tcPr>
-            <w:tcW w:w="3233" w:type="dxa"/>
+            <w:tcW w:w="3421" w:type="dxa"/>
           </w:tcPr>
           <w:p>
             <w:pPr>
@@ -1953,7 +2117,7 @@
         </w:tc>
         <w:tc>
           <w:tcPr>
-            <w:tcW w:w="3233" w:type="dxa"/>
+            <w:tcW w:w="3421" w:type="dxa"/>
           </w:tcPr>
           <w:p>
             <w:pPr>
@@ -1973,7 +2137,7 @@
         </w:tc>
         <w:tc>
           <w:tcPr>
-            <w:tcW w:w="572" w:type="dxa"/>
+            <w:tcW w:w="196" w:type="dxa"/>
           </w:tcPr>
           <w:p>
             <w:pPr>
@@ -2017,20 +2181,20 @@
         </w:tc>
         <w:tc>
           <w:tcPr>
-            <w:tcW w:w="3233" w:type="dxa"/>
-          </w:tcPr>
-          <w:p>
-            <w:pPr>
-              <w:spacing w:before="40" w:after="40" w:line="240" w:lineRule="auto"/>
-              <w:jc w:val="left"/>
-            </w:pPr>
-            <w:r>
-              <w:rPr>
-                <w:color w:val="000000"/>
-                <w:sz w:val="18"/>
-                <w:szCs w:val="18"/>
-              </w:rPr>
-              <w:t xml:space="preserve">No hay autenticación ni autorización: cualquiera puede crear, editar o eliminar</w:t>
+            <w:tcW w:w="3421" w:type="dxa"/>
+          </w:tcPr>
+          <w:p>
+            <w:pPr>
+              <w:spacing w:before="40" w:after="40" w:line="240" w:lineRule="auto"/>
+              <w:jc w:val="left"/>
+            </w:pPr>
+            <w:r>
+              <w:rPr>
+                <w:color w:val="000000"/>
+                <w:sz w:val="18"/>
+                <w:szCs w:val="18"/>
+              </w:rPr>
+              <w:t xml:space="preserve">Las cuentas de demostración usan una clave inicial documentada y no hay bloqueo por intentos fallidos</w:t>
             </w:r>
           </w:p>
         </w:tc>
@@ -2049,45 +2213,62 @@
                 <w:sz w:val="18"/>
                 <w:szCs w:val="18"/>
               </w:rPr>
-              <w:t xml:space="preserve">Alto</w:t>
-            </w:r>
-          </w:p>
-        </w:tc>
-        <w:tc>
-          <w:tcPr>
-            <w:tcW w:w="3233" w:type="dxa"/>
-          </w:tcPr>
-          <w:p>
-            <w:pPr>
-              <w:spacing w:before="40" w:after="40" w:line="240" w:lineRule="auto"/>
-              <w:jc w:val="left"/>
-            </w:pPr>
-            <w:r>
-              <w:rPr>
-                <w:color w:val="000000"/>
-                <w:sz w:val="18"/>
-                <w:szCs w:val="18"/>
-              </w:rPr>
-              <w:t xml:space="preserve">Incorporar ASP.NET Core Identity con roles (Mesero, Cajero, Admin) y pruebas de autorización</w:t>
-            </w:r>
-          </w:p>
-        </w:tc>
-        <w:tc>
-          <w:tcPr>
-            <w:tcW w:w="572" w:type="dxa"/>
-          </w:tcPr>
-          <w:p>
-            <w:pPr>
-              <w:spacing w:before="40" w:after="40" w:line="240" w:lineRule="auto"/>
-              <w:jc w:val="left"/>
-            </w:pPr>
-            <w:r>
-              <w:rPr>
-                <w:color w:val="000000"/>
-                <w:sz w:val="18"/>
-                <w:szCs w:val="18"/>
-              </w:rPr>
-              <w:t xml:space="preserve">Dev / próximo sprint (TD-01)</w:t>
+              <w:t xml:space="preserve">Medio</w:t>
+            </w:r>
+          </w:p>
+        </w:tc>
+        <w:tc>
+          <w:tcPr>
+            <w:tcW w:w="3421" w:type="dxa"/>
+          </w:tcPr>
+          <w:p>
+            <w:pPr>
+              <w:spacing w:before="40" w:after="40" w:line="240" w:lineRule="auto"/>
+              <w:jc w:val="left"/>
+            </w:pPr>
+            <w:r>
+              <w:rPr>
+                <w:color w:val="000000"/>
+                <w:sz w:val="18"/>
+                <w:szCs w:val="18"/>
+              </w:rPr>
+              <w:t xml:space="preserve">Cambiar </w:t>
+            </w:r>
+            <w:r>
+              <w:rPr>
+                <w:rFonts w:ascii="Consolas" w:hAnsi="Consolas" w:cs="Consolas"/>
+                <w:color w:val="000000"/>
+                <w:sz w:val="16"/>
+                <w:szCs w:val="16"/>
+              </w:rPr>
+              <w:t xml:space="preserve">Seed:Clave</w:t>
+            </w:r>
+            <w:r>
+              <w:rPr>
+                <w:color w:val="000000"/>
+                <w:sz w:val="18"/>
+                <w:szCs w:val="18"/>
+              </w:rPr>
+              <w:t xml:space="preserve"> en cualquier despliegue y agregar bloqueo temporal por intentos</w:t>
+            </w:r>
+          </w:p>
+        </w:tc>
+        <w:tc>
+          <w:tcPr>
+            <w:tcW w:w="196" w:type="dxa"/>
+          </w:tcPr>
+          <w:p>
+            <w:pPr>
+              <w:spacing w:before="40" w:after="40" w:line="240" w:lineRule="auto"/>
+              <w:jc w:val="left"/>
+            </w:pPr>
+            <w:r>
+              <w:rPr>
+                <w:color w:val="000000"/>
+                <w:sz w:val="18"/>
+                <w:szCs w:val="18"/>
+              </w:rPr>
+              <w:t xml:space="preserve">Dev / TD-01</w:t>
             </w:r>
           </w:p>
         </w:tc>
@@ -2117,7 +2298,7 @@
         </w:tc>
         <w:tc>
           <w:tcPr>
-            <w:tcW w:w="3233" w:type="dxa"/>
+            <w:tcW w:w="3421" w:type="dxa"/>
           </w:tcPr>
           <w:p>
             <w:pPr>
@@ -2155,7 +2336,7 @@
         </w:tc>
         <w:tc>
           <w:tcPr>
-            <w:tcW w:w="3233" w:type="dxa"/>
+            <w:tcW w:w="3421" w:type="dxa"/>
           </w:tcPr>
           <w:p>
             <w:pPr>
@@ -2174,7 +2355,7 @@
         </w:tc>
         <w:tc>
           <w:tcPr>
-            <w:tcW w:w="572" w:type="dxa"/>
+            <w:tcW w:w="196" w:type="dxa"/>
           </w:tcPr>
           <w:p>
             <w:pPr>
@@ -2217,7 +2398,7 @@
         </w:tc>
         <w:tc>
           <w:tcPr>
-            <w:tcW w:w="3233" w:type="dxa"/>
+            <w:tcW w:w="3421" w:type="dxa"/>
           </w:tcPr>
           <w:p>
             <w:pPr>
@@ -2255,7 +2436,7 @@
         </w:tc>
         <w:tc>
           <w:tcPr>
-            <w:tcW w:w="3233" w:type="dxa"/>
+            <w:tcW w:w="3421" w:type="dxa"/>
           </w:tcPr>
           <w:p>
             <w:pPr>
@@ -2274,7 +2455,7 @@
         </w:tc>
         <w:tc>
           <w:tcPr>
-            <w:tcW w:w="572" w:type="dxa"/>
+            <w:tcW w:w="196" w:type="dxa"/>
           </w:tcPr>
           <w:p>
             <w:pPr>
@@ -2317,7 +2498,7 @@
         </w:tc>
         <w:tc>
           <w:tcPr>
-            <w:tcW w:w="3233" w:type="dxa"/>
+            <w:tcW w:w="3421" w:type="dxa"/>
           </w:tcPr>
           <w:p>
             <w:pPr>
@@ -2381,7 +2562,7 @@
         </w:tc>
         <w:tc>
           <w:tcPr>
-            <w:tcW w:w="3233" w:type="dxa"/>
+            <w:tcW w:w="3421" w:type="dxa"/>
           </w:tcPr>
           <w:p>
             <w:pPr>
@@ -2400,7 +2581,7 @@
         </w:tc>
         <w:tc>
           <w:tcPr>
-            <w:tcW w:w="572" w:type="dxa"/>
+            <w:tcW w:w="196" w:type="dxa"/>
           </w:tcPr>
           <w:p>
             <w:pPr>
@@ -2443,7 +2624,7 @@
         </w:tc>
         <w:tc>
           <w:tcPr>
-            <w:tcW w:w="3233" w:type="dxa"/>
+            <w:tcW w:w="3421" w:type="dxa"/>
           </w:tcPr>
           <w:p>
             <w:pPr>
@@ -2481,7 +2662,7 @@
         </w:tc>
         <w:tc>
           <w:tcPr>
-            <w:tcW w:w="3233" w:type="dxa"/>
+            <w:tcW w:w="3421" w:type="dxa"/>
           </w:tcPr>
           <w:p>
             <w:pPr>
@@ -2517,7 +2698,7 @@
         </w:tc>
         <w:tc>
           <w:tcPr>
-            <w:tcW w:w="572" w:type="dxa"/>
+            <w:tcW w:w="196" w:type="dxa"/>
           </w:tcPr>
           <w:p>
             <w:pPr>
@@ -2564,9 +2745,9 @@
         <w:tblLayout w:type="fixed"/>
       </w:tblPr>
       <w:tblGrid>
-        <w:gridCol w:w="3067"/>
-        <w:gridCol w:w="1387"/>
-        <w:gridCol w:w="4384"/>
+        <w:gridCol w:w="3344"/>
+        <w:gridCol w:w="900"/>
+        <w:gridCol w:w="4594"/>
       </w:tblGrid>
       <w:tr>
         <w:trPr>
@@ -2574,7 +2755,7 @@
         </w:trPr>
         <w:tc>
           <w:tcPr>
-            <w:tcW w:w="3067" w:type="dxa"/>
+            <w:tcW w:w="3344" w:type="dxa"/>
           </w:tcPr>
           <w:p>
             <w:pPr>
@@ -2594,7 +2775,7 @@
         </w:tc>
         <w:tc>
           <w:tcPr>
-            <w:tcW w:w="1387" w:type="dxa"/>
+            <w:tcW w:w="900" w:type="dxa"/>
           </w:tcPr>
           <w:p>
             <w:pPr>
@@ -2614,7 +2795,7 @@
         </w:tc>
         <w:tc>
           <w:tcPr>
-            <w:tcW w:w="4384" w:type="dxa"/>
+            <w:tcW w:w="4594" w:type="dxa"/>
           </w:tcPr>
           <w:p>
             <w:pPr>
@@ -2639,7 +2820,7 @@
         </w:trPr>
         <w:tc>
           <w:tcPr>
-            <w:tcW w:w="3067" w:type="dxa"/>
+            <w:tcW w:w="3344" w:type="dxa"/>
           </w:tcPr>
           <w:p>
             <w:pPr>
@@ -2658,7 +2839,7 @@
         </w:tc>
         <w:tc>
           <w:tcPr>
-            <w:tcW w:w="1387" w:type="dxa"/>
+            <w:tcW w:w="900" w:type="dxa"/>
           </w:tcPr>
           <w:p>
             <w:pPr>
@@ -2677,7 +2858,7 @@
         </w:tc>
         <w:tc>
           <w:tcPr>
-            <w:tcW w:w="4384" w:type="dxa"/>
+            <w:tcW w:w="4594" w:type="dxa"/>
           </w:tcPr>
           <w:p>
             <w:pPr>
@@ -2701,7 +2882,7 @@
         </w:trPr>
         <w:tc>
           <w:tcPr>
-            <w:tcW w:w="3067" w:type="dxa"/>
+            <w:tcW w:w="3344" w:type="dxa"/>
           </w:tcPr>
           <w:p>
             <w:pPr>
@@ -2720,7 +2901,7 @@
         </w:tc>
         <w:tc>
           <w:tcPr>
-            <w:tcW w:w="1387" w:type="dxa"/>
+            <w:tcW w:w="900" w:type="dxa"/>
           </w:tcPr>
           <w:p>
             <w:pPr>
@@ -2739,7 +2920,7 @@
         </w:tc>
         <w:tc>
           <w:tcPr>
-            <w:tcW w:w="4384" w:type="dxa"/>
+            <w:tcW w:w="4594" w:type="dxa"/>
           </w:tcPr>
           <w:p>
             <w:pPr>
@@ -2763,7 +2944,7 @@
         </w:trPr>
         <w:tc>
           <w:tcPr>
-            <w:tcW w:w="3067" w:type="dxa"/>
+            <w:tcW w:w="3344" w:type="dxa"/>
           </w:tcPr>
           <w:p>
             <w:pPr>
@@ -2782,39 +2963,73 @@
         </w:tc>
         <w:tc>
           <w:tcPr>
-            <w:tcW w:w="1387" w:type="dxa"/>
-          </w:tcPr>
-          <w:p>
-            <w:pPr>
-              <w:spacing w:before="40" w:after="40" w:line="240" w:lineRule="auto"/>
-              <w:jc w:val="left"/>
-            </w:pPr>
-            <w:r>
-              <w:rPr>
-                <w:color w:val="000000"/>
-                <w:sz w:val="18"/>
-                <w:szCs w:val="18"/>
-              </w:rPr>
-              <w:t xml:space="preserve">Cumple parcialmente</w:t>
-            </w:r>
-          </w:p>
-        </w:tc>
-        <w:tc>
-          <w:tcPr>
-            <w:tcW w:w="4384" w:type="dxa"/>
-          </w:tcPr>
-          <w:p>
-            <w:pPr>
-              <w:spacing w:before="40" w:after="40" w:line="240" w:lineRule="auto"/>
-              <w:jc w:val="left"/>
-            </w:pPr>
-            <w:r>
-              <w:rPr>
-                <w:color w:val="000000"/>
-                <w:sz w:val="18"/>
-                <w:szCs w:val="18"/>
-              </w:rPr>
-              <w:t xml:space="preserve">Cobertura global 78.8 % (&lt; 80 %); la lógica de reportes y las reglas corregidas están cubiertas</w:t>
+            <w:tcW w:w="900" w:type="dxa"/>
+          </w:tcPr>
+          <w:p>
+            <w:pPr>
+              <w:spacing w:before="40" w:after="40" w:line="240" w:lineRule="auto"/>
+              <w:jc w:val="left"/>
+            </w:pPr>
+            <w:r>
+              <w:rPr>
+                <w:color w:val="000000"/>
+                <w:sz w:val="18"/>
+                <w:szCs w:val="18"/>
+              </w:rPr>
+              <w:t xml:space="preserve">Cumple</w:t>
+            </w:r>
+          </w:p>
+        </w:tc>
+        <w:tc>
+          <w:tcPr>
+            <w:tcW w:w="4594" w:type="dxa"/>
+          </w:tcPr>
+          <w:p>
+            <w:pPr>
+              <w:spacing w:before="40" w:after="40" w:line="240" w:lineRule="auto"/>
+              <w:jc w:val="left"/>
+            </w:pPr>
+            <w:r>
+              <w:rPr>
+                <w:color w:val="000000"/>
+                <w:sz w:val="18"/>
+                <w:szCs w:val="18"/>
+              </w:rPr>
+              <w:t xml:space="preserve">Cobertura global 81.3 % (meta 80 %); </w:t>
+            </w:r>
+            <w:r>
+              <w:rPr>
+                <w:rFonts w:ascii="Consolas" w:hAnsi="Consolas" w:cs="Consolas"/>
+                <w:color w:val="000000"/>
+                <w:sz w:val="16"/>
+                <w:szCs w:val="16"/>
+              </w:rPr>
+              <w:t xml:space="preserve">TelefonosController</w:t>
+            </w:r>
+            <w:r>
+              <w:rPr>
+                <w:color w:val="000000"/>
+                <w:sz w:val="18"/>
+                <w:szCs w:val="18"/>
+              </w:rPr>
+              <w:t xml:space="preserve"> (51.4 %) y </w:t>
+            </w:r>
+            <w:r>
+              <w:rPr>
+                <w:rFonts w:ascii="Consolas" w:hAnsi="Consolas" w:cs="Consolas"/>
+                <w:color w:val="000000"/>
+                <w:sz w:val="16"/>
+                <w:szCs w:val="16"/>
+              </w:rPr>
+              <w:t xml:space="preserve">EmpleadosController</w:t>
+            </w:r>
+            <w:r>
+              <w:rPr>
+                <w:color w:val="000000"/>
+                <w:sz w:val="18"/>
+                <w:szCs w:val="18"/>
+              </w:rPr>
+              <w:t xml:space="preserve"> (60.5 %) quedan bajo la meta individual (TD-04)</w:t>
             </w:r>
           </w:p>
         </w:tc>
@@ -2825,7 +3040,7 @@
         </w:trPr>
         <w:tc>
           <w:tcPr>
-            <w:tcW w:w="3067" w:type="dxa"/>
+            <w:tcW w:w="3344" w:type="dxa"/>
           </w:tcPr>
           <w:p>
             <w:pPr>
@@ -2844,7 +3059,7 @@
         </w:tc>
         <w:tc>
           <w:tcPr>
-            <w:tcW w:w="1387" w:type="dxa"/>
+            <w:tcW w:w="900" w:type="dxa"/>
           </w:tcPr>
           <w:p>
             <w:pPr>
@@ -2863,7 +3078,7 @@
         </w:tc>
         <w:tc>
           <w:tcPr>
-            <w:tcW w:w="4384" w:type="dxa"/>
+            <w:tcW w:w="4594" w:type="dxa"/>
           </w:tcPr>
           <w:p>
             <w:pPr>
@@ -2896,7 +3111,7 @@
         </w:trPr>
         <w:tc>
           <w:tcPr>
-            <w:tcW w:w="3067" w:type="dxa"/>
+            <w:tcW w:w="3344" w:type="dxa"/>
           </w:tcPr>
           <w:p>
             <w:pPr>
@@ -2915,7 +3130,7 @@
         </w:tc>
         <w:tc>
           <w:tcPr>
-            <w:tcW w:w="1387" w:type="dxa"/>
+            <w:tcW w:w="900" w:type="dxa"/>
           </w:tcPr>
           <w:p>
             <w:pPr>
@@ -2934,7 +3149,7 @@
         </w:tc>
         <w:tc>
           <w:tcPr>
-            <w:tcW w:w="4384" w:type="dxa"/>
+            <w:tcW w:w="4594" w:type="dxa"/>
           </w:tcPr>
           <w:p>
             <w:pPr>
@@ -2958,7 +3173,7 @@
         </w:trPr>
         <w:tc>
           <w:tcPr>
-            <w:tcW w:w="3067" w:type="dxa"/>
+            <w:tcW w:w="3344" w:type="dxa"/>
           </w:tcPr>
           <w:p>
             <w:pPr>
@@ -2977,7 +3192,7 @@
         </w:tc>
         <w:tc>
           <w:tcPr>
-            <w:tcW w:w="1387" w:type="dxa"/>
+            <w:tcW w:w="900" w:type="dxa"/>
           </w:tcPr>
           <w:p>
             <w:pPr>
@@ -2996,7 +3211,7 @@
         </w:tc>
         <w:tc>
           <w:tcPr>
-            <w:tcW w:w="4384" w:type="dxa"/>
+            <w:tcW w:w="4594" w:type="dxa"/>
           </w:tcPr>
           <w:p>
             <w:pPr>
@@ -3052,11 +3267,11 @@
         <w:tblLayout w:type="fixed"/>
       </w:tblPr>
       <w:tblGrid>
-        <w:gridCol w:w="3127"/>
-        <w:gridCol w:w="2447"/>
-        <w:gridCol w:w="1087"/>
-        <w:gridCol w:w="1087"/>
-        <w:gridCol w:w="1090"/>
+        <w:gridCol w:w="3194"/>
+        <w:gridCol w:w="3087"/>
+        <w:gridCol w:w="900"/>
+        <w:gridCol w:w="900"/>
+        <w:gridCol w:w="757"/>
       </w:tblGrid>
       <w:tr>
         <w:trPr>
@@ -3064,7 +3279,7 @@
         </w:trPr>
         <w:tc>
           <w:tcPr>
-            <w:tcW w:w="3127" w:type="dxa"/>
+            <w:tcW w:w="3194" w:type="dxa"/>
           </w:tcPr>
           <w:p>
             <w:pPr>
@@ -3084,7 +3299,7 @@
         </w:tc>
         <w:tc>
           <w:tcPr>
-            <w:tcW w:w="2447" w:type="dxa"/>
+            <w:tcW w:w="3087" w:type="dxa"/>
           </w:tcPr>
           <w:p>
             <w:pPr>
@@ -3104,7 +3319,7 @@
         </w:tc>
         <w:tc>
           <w:tcPr>
-            <w:tcW w:w="1087" w:type="dxa"/>
+            <w:tcW w:w="900" w:type="dxa"/>
           </w:tcPr>
           <w:p>
             <w:pPr>
@@ -3124,7 +3339,7 @@
         </w:tc>
         <w:tc>
           <w:tcPr>
-            <w:tcW w:w="1087" w:type="dxa"/>
+            <w:tcW w:w="900" w:type="dxa"/>
           </w:tcPr>
           <w:p>
             <w:pPr>
@@ -3144,7 +3359,7 @@
         </w:tc>
         <w:tc>
           <w:tcPr>
-            <w:tcW w:w="1090" w:type="dxa"/>
+            <w:tcW w:w="757" w:type="dxa"/>
           </w:tcPr>
           <w:p>
             <w:pPr>
@@ -3169,26 +3384,26 @@
         </w:trPr>
         <w:tc>
           <w:tcPr>
-            <w:tcW w:w="3127" w:type="dxa"/>
-          </w:tcPr>
-          <w:p>
-            <w:pPr>
-              <w:spacing w:before="40" w:after="40" w:line="240" w:lineRule="auto"/>
-              <w:jc w:val="left"/>
-            </w:pPr>
-            <w:r>
-              <w:rPr>
-                <w:color w:val="000000"/>
-                <w:sz w:val="18"/>
-                <w:szCs w:val="18"/>
-              </w:rPr>
-              <w:t xml:space="preserve">Unitarias + integración</w:t>
-            </w:r>
-          </w:p>
-        </w:tc>
-        <w:tc>
-          <w:tcPr>
-            <w:tcW w:w="2447" w:type="dxa"/>
+            <w:tcW w:w="3194" w:type="dxa"/>
+          </w:tcPr>
+          <w:p>
+            <w:pPr>
+              <w:spacing w:before="40" w:after="40" w:line="240" w:lineRule="auto"/>
+              <w:jc w:val="left"/>
+            </w:pPr>
+            <w:r>
+              <w:rPr>
+                <w:color w:val="000000"/>
+                <w:sz w:val="18"/>
+                <w:szCs w:val="18"/>
+              </w:rPr>
+              <w:t xml:space="preserve">Unitarias</w:t>
+            </w:r>
+          </w:p>
+        </w:tc>
+        <w:tc>
+          <w:tcPr>
+            <w:tcW w:w="3087" w:type="dxa"/>
           </w:tcPr>
           <w:p>
             <w:pPr>
@@ -3207,45 +3422,45 @@
         </w:tc>
         <w:tc>
           <w:tcPr>
-            <w:tcW w:w="1087" w:type="dxa"/>
-          </w:tcPr>
-          <w:p>
-            <w:pPr>
-              <w:spacing w:before="40" w:after="40" w:line="240" w:lineRule="auto"/>
-              <w:jc w:val="left"/>
-            </w:pPr>
-            <w:r>
-              <w:rPr>
-                <w:color w:val="000000"/>
-                <w:sz w:val="18"/>
-                <w:szCs w:val="18"/>
-              </w:rPr>
-              <w:t xml:space="preserve">140</w:t>
-            </w:r>
-          </w:p>
-        </w:tc>
-        <w:tc>
-          <w:tcPr>
-            <w:tcW w:w="1087" w:type="dxa"/>
-          </w:tcPr>
-          <w:p>
-            <w:pPr>
-              <w:spacing w:before="40" w:after="40" w:line="240" w:lineRule="auto"/>
-              <w:jc w:val="left"/>
-            </w:pPr>
-            <w:r>
-              <w:rPr>
-                <w:color w:val="000000"/>
-                <w:sz w:val="18"/>
-                <w:szCs w:val="18"/>
-              </w:rPr>
-              <w:t xml:space="preserve">140</w:t>
-            </w:r>
-          </w:p>
-        </w:tc>
-        <w:tc>
-          <w:tcPr>
-            <w:tcW w:w="1090" w:type="dxa"/>
+            <w:tcW w:w="900" w:type="dxa"/>
+          </w:tcPr>
+          <w:p>
+            <w:pPr>
+              <w:spacing w:before="40" w:after="40" w:line="240" w:lineRule="auto"/>
+              <w:jc w:val="left"/>
+            </w:pPr>
+            <w:r>
+              <w:rPr>
+                <w:color w:val="000000"/>
+                <w:sz w:val="18"/>
+                <w:szCs w:val="18"/>
+              </w:rPr>
+              <w:t xml:space="preserve">46</w:t>
+            </w:r>
+          </w:p>
+        </w:tc>
+        <w:tc>
+          <w:tcPr>
+            <w:tcW w:w="900" w:type="dxa"/>
+          </w:tcPr>
+          <w:p>
+            <w:pPr>
+              <w:spacing w:before="40" w:after="40" w:line="240" w:lineRule="auto"/>
+              <w:jc w:val="left"/>
+            </w:pPr>
+            <w:r>
+              <w:rPr>
+                <w:color w:val="000000"/>
+                <w:sz w:val="18"/>
+                <w:szCs w:val="18"/>
+              </w:rPr>
+              <w:t xml:space="preserve">46</w:t>
+            </w:r>
+          </w:p>
+        </w:tc>
+        <w:tc>
+          <w:tcPr>
+            <w:tcW w:w="757" w:type="dxa"/>
           </w:tcPr>
           <w:p>
             <w:pPr>
@@ -3269,83 +3484,83 @@
         </w:trPr>
         <w:tc>
           <w:tcPr>
-            <w:tcW w:w="3127" w:type="dxa"/>
-          </w:tcPr>
-          <w:p>
-            <w:pPr>
-              <w:spacing w:before="40" w:after="40" w:line="240" w:lineRule="auto"/>
-              <w:jc w:val="left"/>
-            </w:pPr>
-            <w:r>
-              <w:rPr>
-                <w:color w:val="000000"/>
-                <w:sz w:val="18"/>
-                <w:szCs w:val="18"/>
-              </w:rPr>
-              <w:t xml:space="preserve">E2E</w:t>
-            </w:r>
-          </w:p>
-        </w:tc>
-        <w:tc>
-          <w:tcPr>
-            <w:tcW w:w="2447" w:type="dxa"/>
-          </w:tcPr>
-          <w:p>
-            <w:pPr>
-              <w:spacing w:before="40" w:after="40" w:line="240" w:lineRule="auto"/>
-              <w:jc w:val="left"/>
-            </w:pPr>
-            <w:r>
-              <w:rPr>
-                <w:color w:val="000000"/>
-                <w:sz w:val="18"/>
-                <w:szCs w:val="18"/>
-              </w:rPr>
-              <w:t xml:space="preserve">Selenium WebDriver</w:t>
-            </w:r>
-          </w:p>
-        </w:tc>
-        <w:tc>
-          <w:tcPr>
-            <w:tcW w:w="1087" w:type="dxa"/>
-          </w:tcPr>
-          <w:p>
-            <w:pPr>
-              <w:spacing w:before="40" w:after="40" w:line="240" w:lineRule="auto"/>
-              <w:jc w:val="left"/>
-            </w:pPr>
-            <w:r>
-              <w:rPr>
-                <w:color w:val="000000"/>
-                <w:sz w:val="18"/>
-                <w:szCs w:val="18"/>
-              </w:rPr>
-              <w:t xml:space="preserve">11</w:t>
-            </w:r>
-          </w:p>
-        </w:tc>
-        <w:tc>
-          <w:tcPr>
-            <w:tcW w:w="1087" w:type="dxa"/>
-          </w:tcPr>
-          <w:p>
-            <w:pPr>
-              <w:spacing w:before="40" w:after="40" w:line="240" w:lineRule="auto"/>
-              <w:jc w:val="left"/>
-            </w:pPr>
-            <w:r>
-              <w:rPr>
-                <w:color w:val="000000"/>
-                <w:sz w:val="18"/>
-                <w:szCs w:val="18"/>
-              </w:rPr>
-              <w:t xml:space="preserve">11</w:t>
-            </w:r>
-          </w:p>
-        </w:tc>
-        <w:tc>
-          <w:tcPr>
-            <w:tcW w:w="1090" w:type="dxa"/>
+            <w:tcW w:w="3194" w:type="dxa"/>
+          </w:tcPr>
+          <w:p>
+            <w:pPr>
+              <w:spacing w:before="40" w:after="40" w:line="240" w:lineRule="auto"/>
+              <w:jc w:val="left"/>
+            </w:pPr>
+            <w:r>
+              <w:rPr>
+                <w:color w:val="000000"/>
+                <w:sz w:val="18"/>
+                <w:szCs w:val="18"/>
+              </w:rPr>
+              <w:t xml:space="preserve">Integración y aceptación (BDD)</w:t>
+            </w:r>
+          </w:p>
+        </w:tc>
+        <w:tc>
+          <w:tcPr>
+            <w:tcW w:w="3087" w:type="dxa"/>
+          </w:tcPr>
+          <w:p>
+            <w:pPr>
+              <w:spacing w:before="40" w:after="40" w:line="240" w:lineRule="auto"/>
+              <w:jc w:val="left"/>
+            </w:pPr>
+            <w:r>
+              <w:rPr>
+                <w:color w:val="000000"/>
+                <w:sz w:val="18"/>
+                <w:szCs w:val="18"/>
+              </w:rPr>
+              <w:t xml:space="preserve">xUnit + WebApplicationFactory</w:t>
+            </w:r>
+          </w:p>
+        </w:tc>
+        <w:tc>
+          <w:tcPr>
+            <w:tcW w:w="900" w:type="dxa"/>
+          </w:tcPr>
+          <w:p>
+            <w:pPr>
+              <w:spacing w:before="40" w:after="40" w:line="240" w:lineRule="auto"/>
+              <w:jc w:val="left"/>
+            </w:pPr>
+            <w:r>
+              <w:rPr>
+                <w:color w:val="000000"/>
+                <w:sz w:val="18"/>
+                <w:szCs w:val="18"/>
+              </w:rPr>
+              <w:t xml:space="preserve">134</w:t>
+            </w:r>
+          </w:p>
+        </w:tc>
+        <w:tc>
+          <w:tcPr>
+            <w:tcW w:w="900" w:type="dxa"/>
+          </w:tcPr>
+          <w:p>
+            <w:pPr>
+              <w:spacing w:before="40" w:after="40" w:line="240" w:lineRule="auto"/>
+              <w:jc w:val="left"/>
+            </w:pPr>
+            <w:r>
+              <w:rPr>
+                <w:color w:val="000000"/>
+                <w:sz w:val="18"/>
+                <w:szCs w:val="18"/>
+              </w:rPr>
+              <w:t xml:space="preserve">134</w:t>
+            </w:r>
+          </w:p>
+        </w:tc>
+        <w:tc>
+          <w:tcPr>
+            <w:tcW w:w="757" w:type="dxa"/>
           </w:tcPr>
           <w:p>
             <w:pPr>
@@ -3369,7 +3584,7 @@
         </w:trPr>
         <w:tc>
           <w:tcPr>
-            <w:tcW w:w="3127" w:type="dxa"/>
+            <w:tcW w:w="3194" w:type="dxa"/>
           </w:tcPr>
           <w:p>
             <w:pPr>
@@ -3388,64 +3603,64 @@
         </w:tc>
         <w:tc>
           <w:tcPr>
-            <w:tcW w:w="2447" w:type="dxa"/>
-          </w:tcPr>
-          <w:p>
-            <w:pPr>
-              <w:spacing w:before="40" w:after="40" w:line="240" w:lineRule="auto"/>
-              <w:jc w:val="left"/>
-            </w:pPr>
-            <w:r>
-              <w:rPr>
-                <w:color w:val="000000"/>
-                <w:sz w:val="18"/>
-                <w:szCs w:val="18"/>
-              </w:rPr>
-              <w:t xml:space="preserve">Cypress</w:t>
-            </w:r>
-          </w:p>
-        </w:tc>
-        <w:tc>
-          <w:tcPr>
-            <w:tcW w:w="1087" w:type="dxa"/>
-          </w:tcPr>
-          <w:p>
-            <w:pPr>
-              <w:spacing w:before="40" w:after="40" w:line="240" w:lineRule="auto"/>
-              <w:jc w:val="left"/>
-            </w:pPr>
-            <w:r>
-              <w:rPr>
-                <w:color w:val="000000"/>
-                <w:sz w:val="18"/>
-                <w:szCs w:val="18"/>
-              </w:rPr>
-              <w:t xml:space="preserve">13</w:t>
-            </w:r>
-          </w:p>
-        </w:tc>
-        <w:tc>
-          <w:tcPr>
-            <w:tcW w:w="1087" w:type="dxa"/>
-          </w:tcPr>
-          <w:p>
-            <w:pPr>
-              <w:spacing w:before="40" w:after="40" w:line="240" w:lineRule="auto"/>
-              <w:jc w:val="left"/>
-            </w:pPr>
-            <w:r>
-              <w:rPr>
-                <w:color w:val="000000"/>
-                <w:sz w:val="18"/>
-                <w:szCs w:val="18"/>
-              </w:rPr>
-              <w:t xml:space="preserve">13</w:t>
-            </w:r>
-          </w:p>
-        </w:tc>
-        <w:tc>
-          <w:tcPr>
-            <w:tcW w:w="1090" w:type="dxa"/>
+            <w:tcW w:w="3087" w:type="dxa"/>
+          </w:tcPr>
+          <w:p>
+            <w:pPr>
+              <w:spacing w:before="40" w:after="40" w:line="240" w:lineRule="auto"/>
+              <w:jc w:val="left"/>
+            </w:pPr>
+            <w:r>
+              <w:rPr>
+                <w:color w:val="000000"/>
+                <w:sz w:val="18"/>
+                <w:szCs w:val="18"/>
+              </w:rPr>
+              <w:t xml:space="preserve">Selenium WebDriver</w:t>
+            </w:r>
+          </w:p>
+        </w:tc>
+        <w:tc>
+          <w:tcPr>
+            <w:tcW w:w="900" w:type="dxa"/>
+          </w:tcPr>
+          <w:p>
+            <w:pPr>
+              <w:spacing w:before="40" w:after="40" w:line="240" w:lineRule="auto"/>
+              <w:jc w:val="left"/>
+            </w:pPr>
+            <w:r>
+              <w:rPr>
+                <w:color w:val="000000"/>
+                <w:sz w:val="18"/>
+                <w:szCs w:val="18"/>
+              </w:rPr>
+              <w:t xml:space="preserve">17</w:t>
+            </w:r>
+          </w:p>
+        </w:tc>
+        <w:tc>
+          <w:tcPr>
+            <w:tcW w:w="900" w:type="dxa"/>
+          </w:tcPr>
+          <w:p>
+            <w:pPr>
+              <w:spacing w:before="40" w:after="40" w:line="240" w:lineRule="auto"/>
+              <w:jc w:val="left"/>
+            </w:pPr>
+            <w:r>
+              <w:rPr>
+                <w:color w:val="000000"/>
+                <w:sz w:val="18"/>
+                <w:szCs w:val="18"/>
+              </w:rPr>
+              <w:t xml:space="preserve">17</w:t>
+            </w:r>
+          </w:p>
+        </w:tc>
+        <w:tc>
+          <w:tcPr>
+            <w:tcW w:w="757" w:type="dxa"/>
           </w:tcPr>
           <w:p>
             <w:pPr>
@@ -3469,7 +3684,107 @@
         </w:trPr>
         <w:tc>
           <w:tcPr>
-            <w:tcW w:w="3127" w:type="dxa"/>
+            <w:tcW w:w="3194" w:type="dxa"/>
+          </w:tcPr>
+          <w:p>
+            <w:pPr>
+              <w:spacing w:before="40" w:after="40" w:line="240" w:lineRule="auto"/>
+              <w:jc w:val="left"/>
+            </w:pPr>
+            <w:r>
+              <w:rPr>
+                <w:color w:val="000000"/>
+                <w:sz w:val="18"/>
+                <w:szCs w:val="18"/>
+              </w:rPr>
+              <w:t xml:space="preserve">E2E</w:t>
+            </w:r>
+          </w:p>
+        </w:tc>
+        <w:tc>
+          <w:tcPr>
+            <w:tcW w:w="3087" w:type="dxa"/>
+          </w:tcPr>
+          <w:p>
+            <w:pPr>
+              <w:spacing w:before="40" w:after="40" w:line="240" w:lineRule="auto"/>
+              <w:jc w:val="left"/>
+            </w:pPr>
+            <w:r>
+              <w:rPr>
+                <w:color w:val="000000"/>
+                <w:sz w:val="18"/>
+                <w:szCs w:val="18"/>
+              </w:rPr>
+              <w:t xml:space="preserve">Cypress</w:t>
+            </w:r>
+          </w:p>
+        </w:tc>
+        <w:tc>
+          <w:tcPr>
+            <w:tcW w:w="900" w:type="dxa"/>
+          </w:tcPr>
+          <w:p>
+            <w:pPr>
+              <w:spacing w:before="40" w:after="40" w:line="240" w:lineRule="auto"/>
+              <w:jc w:val="left"/>
+            </w:pPr>
+            <w:r>
+              <w:rPr>
+                <w:color w:val="000000"/>
+                <w:sz w:val="18"/>
+                <w:szCs w:val="18"/>
+              </w:rPr>
+              <w:t xml:space="preserve">19</w:t>
+            </w:r>
+          </w:p>
+        </w:tc>
+        <w:tc>
+          <w:tcPr>
+            <w:tcW w:w="900" w:type="dxa"/>
+          </w:tcPr>
+          <w:p>
+            <w:pPr>
+              <w:spacing w:before="40" w:after="40" w:line="240" w:lineRule="auto"/>
+              <w:jc w:val="left"/>
+            </w:pPr>
+            <w:r>
+              <w:rPr>
+                <w:color w:val="000000"/>
+                <w:sz w:val="18"/>
+                <w:szCs w:val="18"/>
+              </w:rPr>
+              <w:t xml:space="preserve">19</w:t>
+            </w:r>
+          </w:p>
+        </w:tc>
+        <w:tc>
+          <w:tcPr>
+            <w:tcW w:w="757" w:type="dxa"/>
+          </w:tcPr>
+          <w:p>
+            <w:pPr>
+              <w:spacing w:before="40" w:after="40" w:line="240" w:lineRule="auto"/>
+              <w:jc w:val="left"/>
+            </w:pPr>
+            <w:r>
+              <w:rPr>
+                <w:color w:val="000000"/>
+                <w:sz w:val="18"/>
+                <w:szCs w:val="18"/>
+              </w:rPr>
+              <w:t xml:space="preserve">0</w:t>
+            </w:r>
+          </w:p>
+        </w:tc>
+      </w:tr>
+      <w:tr>
+        <w:trPr>
+          <w:cantSplit/>
+        </w:trPr>
+        <w:tc>
+          <w:tcPr>
+            <w:tcW w:w="3194" w:type="dxa"/>
           </w:tcPr>
           <w:p>
             <w:pPr>
@@ -3489,18 +3804,18 @@
         </w:tc>
         <w:tc>
           <w:tcPr>
-            <w:tcW w:w="2447" w:type="dxa"/>
-          </w:tcPr>
-          <w:p>
-            <w:pPr>
-              <w:spacing w:before="40" w:after="40" w:line="240" w:lineRule="auto"/>
-              <w:jc w:val="left"/>
-            </w:pPr>
-          </w:p>
-        </w:tc>
-        <w:tc>
-          <w:tcPr>
-            <w:tcW w:w="1087" w:type="dxa"/>
+            <w:tcW w:w="3087" w:type="dxa"/>
+          </w:tcPr>
+          <w:p>
+            <w:pPr>
+              <w:spacing w:before="40" w:after="40" w:line="240" w:lineRule="auto"/>
+              <w:jc w:val="left"/>
+            </w:pPr>
+          </w:p>
+        </w:tc>
+        <w:tc>
+          <w:tcPr>
+            <w:tcW w:w="900" w:type="dxa"/>
           </w:tcPr>
           <w:p>
             <w:pPr>
@@ -3514,13 +3829,13 @@
                 <w:sz w:val="18"/>
                 <w:szCs w:val="18"/>
               </w:rPr>
-              <w:t xml:space="preserve">164</w:t>
-            </w:r>
-          </w:p>
-        </w:tc>
-        <w:tc>
-          <w:tcPr>
-            <w:tcW w:w="1087" w:type="dxa"/>
+              <w:t xml:space="preserve">216</w:t>
+            </w:r>
+          </w:p>
+        </w:tc>
+        <w:tc>
+          <w:tcPr>
+            <w:tcW w:w="900" w:type="dxa"/>
           </w:tcPr>
           <w:p>
             <w:pPr>
@@ -3534,13 +3849,13 @@
                 <w:sz w:val="18"/>
                 <w:szCs w:val="18"/>
               </w:rPr>
-              <w:t xml:space="preserve">164</w:t>
-            </w:r>
-          </w:p>
-        </w:tc>
-        <w:tc>
-          <w:tcPr>
-            <w:tcW w:w="1090" w:type="dxa"/>
+              <w:t xml:space="preserve">216</w:t>
+            </w:r>
+          </w:p>
+        </w:tc>
+        <w:tc>
+          <w:tcPr>
+            <w:tcW w:w="757" w:type="dxa"/>
           </w:tcPr>
           <w:p>
             <w:pPr>
@@ -3576,24 +3891,7 @@
           <w:sz w:val="22"/>
           <w:szCs w:val="22"/>
         </w:rPr>
-        <w:t xml:space="preserve">Incidencias de ejecución (del propio proceso de pruebas): en la primera corrida de Cypress un escenario falló por un selector mal escrito en la prueba (no por la aplicación) y se corrigió; Cypress también falló antes por un archivo </w:t>
-      </w:r>
-      <w:r>
-        <w:rPr>
-          <w:rFonts w:ascii="Consolas" w:hAnsi="Consolas" w:cs="Consolas"/>
-          <w:color w:val="000000"/>
-          <w:sz w:val="20"/>
-          <w:szCs w:val="20"/>
-        </w:rPr>
-        <w:t xml:space="preserve">package.json</w:t>
-      </w:r>
-      <w:r>
-        <w:rPr>
-          <w:color w:val="000000"/>
-          <w:sz w:val="22"/>
-          <w:szCs w:val="22"/>
-        </w:rPr>
-        <w:t xml:space="preserve"> con BOM. No se ocultó ningún fallo.</w:t>
+        <w:t xml:space="preserve">Incidencias de ejecución (del propio proceso de pruebas): en la primera corrida de Cypress un escenario falló por un selector mal escrito en la prueba (no por la aplicación); al agregar el login, otra corrida falló porque faltaba definir el inicio de sesión en el archivo de pruebas. Ambos fallos eran de las pruebas y se corrigieron; no se ocultó ningún fallo.</w:t>
       </w:r>
     </w:p>
     <w:p>
@@ -3636,7 +3934,7 @@
           <w:sz w:val="22"/>
           <w:szCs w:val="22"/>
         </w:rPr>
-        <w:t xml:space="preserve">Sprint siguiente: TD-01 (autenticación) y TD-04 (cobertura).</w:t>
+        <w:t xml:space="preserve">Sprint siguiente: TD-01 (endurecer claves y bloqueo de intentos) y TD-04 (cobertura).</w:t>
       </w:r>
     </w:p>
     <w:p>

</xml_diff>